<commit_message>
Clarify reviewer-defense evidence boundaries
</commit_message>
<xml_diff>
--- a/manuscript/NMI_MANUSCRIPT_CANDIDATE.docx
+++ b/manuscript/NMI_MANUSCRIPT_CANDIDATE.docx
@@ -111,7 +111,7 @@
           <w:rFonts w:ascii="Cambria" w:hAnsi="Cambria"/>
           <w:sz w:val="21"/>
         </w:rPr>
-        <w:t xml:space="preserve">Here we ask: </w:t>
+        <w:t xml:space="preserve">Here we ask </w:t>
       </w:r>
       <w:r>
         <w:rPr>
@@ -119,14 +119,14 @@
           <w:b/>
           <w:sz w:val="21"/>
         </w:rPr>
-        <w:t>what can this project portfolio establish about the transfer of biologically grounded computation into artificial systems?</w:t>
+        <w:t>which evidential transitions in neural-to-artificial transfer require separate empirical support</w:t>
       </w:r>
       <w:r>
         <w:rPr>
           <w:rFonts w:ascii="Cambria" w:hAnsi="Cambria"/>
           <w:sz w:val="21"/>
         </w:rPr>
-        <w:t xml:space="preserve"> We treat this as a retrospective evidence audit, not as a pooled test or a claim that the projects were prospectively designed as one study. Figure 2 uses the same four questions—biological structure, source-supported computation, information correspondence and artificial utility—to show where each portfolio contributes evidence and where transitions require separate tests. Our contribution is an evidence-bounded case synthesis of two research portfolios, three earlier synthetic tests, and one newly selected source-informed synthetic test; it is not a new general transfer law. The map is an organizing proposal rather than a validated transfer theory.</w:t>
+        <w:t>. We address this through a retrospective, case-based synthesis, not a pooled test or a claim that the projects were prospectively designed as one study. Figure 2 uses four organizing questions—biological structure, source-supported computation, information correspondence and artificial utility—to show where each portfolio contributes evidence and where transitions require separate tests. These cases have no common estimand and do not jointly test a unified transfer law. Our contribution is an evidence-bounded synthesis of two research portfolios, three earlier synthetic tests and one newly selected source-informed synthetic test. The map is an organizing proposal rather than a validated transfer theory.</w:t>
       </w:r>
     </w:p>
     <w:p>
@@ -146,7 +146,7 @@
           <w:rFonts w:ascii="Cambria" w:hAnsi="Cambria"/>
           <w:sz w:val="21"/>
         </w:rPr>
-        <w:t>We examined evidence at distinct levels: connectome-based structure tests (Fig. 3), published biological computations and source-data analyses, and four synthetic experiments on execution-state information, temporal correspondence, fast–slow dynamics and feature-tuned contextual inhibition. NeuroMotif and NeuroMech were independent research portfolios with different tasks and units of analysis; their outcomes were not pooled. M2 and M5 were designed after earlier project outcomes; DMP and the V1 test were later post-result additions. Each protocol was frozen locally before its own outcome run, but none was a project-level preregistration or an independent biological validation (Supplementary Methods S1, S4 and S5; Supplementary Tables S3–S5).</w:t>
+        <w:t>We examined evidence at distinct levels: connectome-based structure tests (Fig. 3), published biological computations and source-data analyses, and four synthetic experiments on execution-state information, temporal correspondence, fast–slow dynamics and feature-tuned contextual inhibition. NeuroMotif and NeuroMech were independent research portfolios with different tasks and units of analysis; their outcomes were not pooled. M2 and M5 were designed after earlier project outcomes; DMP and the V1 test were later post-result additions. Each protocol was frozen locally before its own outcome run, but none was a project-level preregistration or an independent biological validation (Supplementary Methods S1, S4 and S5; Supplementary Tables S3–S7).</w:t>
       </w:r>
     </w:p>
     <w:p>
@@ -560,21 +560,7 @@
           <w:rFonts w:ascii="Cambria" w:hAnsi="Cambria"/>
           <w:sz w:val="21"/>
         </w:rPr>
-        <w:t xml:space="preserve">NeuroConverge is a retrospective synthesis of two independently developed research portfolios, with four separately analysed synthetic tests. It is not a systematic review, a prospectively unified biological study or a meta-analysis. We imported all 39 records from the NeuroMech Route-D V3 classification matrix and retained their original evidence labels, units, statuses and interpretation limits in Supplementary Table S1. Selected packages on the separate </w:t>
-      </w:r>
-      <w:r>
-        <w:rPr>
-          <w:rFonts w:ascii="Cambria Math" w:hAnsi="Cambria Math"/>
-          <w:sz w:val="21"/>
-        </w:rPr>
-        <w:t>experiment-publication</w:t>
-      </w:r>
-      <w:r>
-        <w:rPr>
-          <w:rFonts w:ascii="Cambria" w:hAnsi="Cambria"/>
-          <w:sz w:val="21"/>
-        </w:rPr>
-        <w:t xml:space="preserve"> branch were crosswalked to that matrix (Supplementary Table S2). Some packages lack an exact matrix record; this limits the completeness of the source inventory, not the identities of the separately hashed packages. File identities and source states are summarized in Supplementary Methods S2. RR18 and RR19 belong to separately governed workstreams and were excluded from this synthesis.</w:t>
+        <w:t>NeuroConverge is a retrospective, case-based synthesis of two independently developed research portfolios, with four separately analysed synthetic tests. It is not a systematic review, a prospectively unified biological study or a meta-analysis, and its cases have no common estimand. We imported all 39 records from the NeuroMech Route-D V3 classification matrix and retained their original evidence labels, units, statuses and interpretation limits in Supplementary Table S1. The nine claims in the initial publication draft are accounted for separately in Supplementary Table S2: three map to V3 main-text candidates, one is an editorial synthesis, three are hash-pinned branch records without exact V3 rows, one is a post-result follow-up whose relationship to M10 remains unresolved, and one maps to a V3 supplementary-only record. The C08 contract identifies it as a distinct follow-up to V2; we do not merge it with V2 or make an M10-linked claim. RR18 and RR19 appear as separately governed exclusions in the 39-row disposition matrix and are excluded from the manuscript synthesis.</w:t>
       </w:r>
     </w:p>
     <w:p>

</xml_diff>